<commit_message>
add hex / unsigned number handleing
</commit_message>
<xml_diff>
--- a/documets/MICRO-BASIC-Manual.docx
+++ b/documets/MICRO-BASIC-Manual.docx
@@ -18,7 +18,7 @@
           <w:sz w:val="56"/>
           <w:szCs w:val="56"/>
         </w:rPr>
-        <w:t>MICRO-BASIC 2.1</w:t>
+        <w:t>Enhanced Micro-Basic 2.2</w:t>
       </w:r>
     </w:p>
     <w:p>
@@ -71,7 +71,7 @@
           <w:sz w:val="22"/>
           <w:szCs w:val="22"/>
         </w:rPr>
-        <w:t>Originally by Dave Dunfield  •  Modernized 2026</w:t>
+        <w:t>Originally by Dave Dunfield  •  Enhanced fork 2026</w:t>
       </w:r>
     </w:p>
     <w:p>
@@ -2587,7 +2587,346 @@
           <w:sz w:val="26"/>
           <w:szCs w:val="26"/>
         </w:rPr>
-        <w:t>4.2 Operator Precedence</w:t>
+        <w:t>4.2 Numeric Literal Prefixes</w:t>
+      </w:r>
+    </w:p>
+    <w:p>
+      <w:pPr>
+        <w:pStyle w:val="Normal"/>
+        <w:spacing w:before="60" w:after="60"/>
+        <w:rPr/>
+      </w:pPr>
+      <w:r>
+        <w:rPr>
+          <w:rFonts w:eastAsia="Arial" w:cs="Arial"/>
+          <w:sz w:val="22"/>
+          <w:szCs w:val="22"/>
+          <w:color w:val="1F1F1F"/>
+        </w:rPr>
+        <w:t xml:space="preserve">Integer literals are normally written as signed decimal. Two prefix characters allow hexadecimal and unsigned decimal input. All values are stored as signed 16-bit integers regardless of how they are written.</w:t>
+      </w:r>
+    </w:p>
+    <w:tbl>
+      <w:tblPr>
+        <w:tblW w:w="9360" w:type="dxa"/>
+        <w:jc w:val="start"/>
+        <w:tblInd w:w="0" w:type="dxa"/>
+        <w:tblLayout w:type="fixed"/>
+        <w:tblCellMar>
+          <w:top w:w="80" w:type="dxa"/>
+          <w:start w:w="120" w:type="dxa"/>
+          <w:bottom w:w="80" w:type="dxa"/>
+          <w:end w:w="120" w:type="dxa"/>
+        </w:tblCellMar>
+      </w:tblPr>
+      <w:tblGrid>
+        <w:gridCol w:w="1400"/>
+        <w:gridCol w:w="2600"/>
+        <w:gridCol w:w="5360"/>
+      </w:tblGrid>
+      <w:tr>
+        <w:trPr>
+          <w:tblHeader w:val="true"/>
+        </w:trPr>
+        <w:tc>
+          <w:tcPr>
+            <w:tcW w:w="1400" w:type="dxa"/>
+            <w:tcBorders>
+              <w:top w:val="single" w:sz="2" w:space="0" w:color="CCCCCC"/>
+              <w:start w:val="single" w:sz="2" w:space="0" w:color="CCCCCC"/>
+              <w:bottom w:val="single" w:sz="2" w:space="0" w:color="CCCCCC"/>
+              <w:end w:val="single" w:sz="2" w:space="0" w:color="CCCCCC"/>
+            </w:tcBorders>
+            <w:shd w:fill="2E75B6" w:val="clear"/>
+          </w:tcPr>
+          <w:p>
+            <w:pPr>
+              <w:pStyle w:val="Normal"/>
+              <w:rPr/>
+            </w:pPr>
+            <w:r>
+              <w:rPr>
+                <w:rFonts w:eastAsia="Arial" w:cs="Arial"/>
+                <w:b/>
+                <w:bCs/>
+                <w:color w:val="FFFFFF"/>
+                <w:sz w:val="22"/>
+                <w:szCs w:val="22"/>
+              </w:rPr>
+              <w:t>Prefix</w:t>
+            </w:r>
+          </w:p>
+        </w:tc>
+        <w:tc>
+          <w:tcPr>
+            <w:tcW w:w="2600" w:type="dxa"/>
+            <w:tcBorders>
+              <w:top w:val="single" w:sz="2" w:space="0" w:color="CCCCCC"/>
+              <w:start w:val="single" w:sz="2" w:space="0" w:color="CCCCCC"/>
+              <w:bottom w:val="single" w:sz="2" w:space="0" w:color="CCCCCC"/>
+              <w:end w:val="single" w:sz="2" w:space="0" w:color="CCCCCC"/>
+            </w:tcBorders>
+            <w:shd w:fill="2E75B6" w:val="clear"/>
+          </w:tcPr>
+          <w:p>
+            <w:pPr>
+              <w:pStyle w:val="Normal"/>
+              <w:rPr/>
+            </w:pPr>
+            <w:r>
+              <w:rPr>
+                <w:rFonts w:eastAsia="Arial" w:cs="Arial"/>
+                <w:b/>
+                <w:bCs/>
+                <w:color w:val="FFFFFF"/>
+                <w:sz w:val="22"/>
+                <w:szCs w:val="22"/>
+              </w:rPr>
+              <w:t>Type</w:t>
+            </w:r>
+          </w:p>
+        </w:tc>
+        <w:tc>
+          <w:tcPr>
+            <w:tcW w:w="5360" w:type="dxa"/>
+            <w:tcBorders>
+              <w:top w:val="single" w:sz="2" w:space="0" w:color="CCCCCC"/>
+              <w:start w:val="single" w:sz="2" w:space="0" w:color="CCCCCC"/>
+              <w:bottom w:val="single" w:sz="2" w:space="0" w:color="CCCCCC"/>
+              <w:end w:val="single" w:sz="2" w:space="0" w:color="CCCCCC"/>
+            </w:tcBorders>
+            <w:shd w:fill="2E75B6" w:val="clear"/>
+          </w:tcPr>
+          <w:p>
+            <w:pPr>
+              <w:pStyle w:val="Normal"/>
+              <w:rPr/>
+            </w:pPr>
+            <w:r>
+              <w:rPr>
+                <w:rFonts w:eastAsia="Arial" w:cs="Arial"/>
+                <w:b/>
+                <w:bCs/>
+                <w:color w:val="FFFFFF"/>
+                <w:sz w:val="22"/>
+                <w:szCs w:val="22"/>
+              </w:rPr>
+              <w:t>Example</w:t>
+            </w:r>
+          </w:p>
+        </w:tc>
+      </w:tr>
+      <w:tr>
+        <w:trPr/>
+        <w:tc>
+          <w:tcPr>
+            <w:tcW w:w="1400" w:type="dxa"/>
+            <w:tcBorders>
+              <w:top w:val="single" w:sz="2" w:space="0" w:color="CCCCCC"/>
+              <w:start w:val="single" w:sz="2" w:space="0" w:color="CCCCCC"/>
+              <w:bottom w:val="single" w:sz="2" w:space="0" w:color="CCCCCC"/>
+              <w:end w:val="single" w:sz="2" w:space="0" w:color="CCCCCC"/>
+            </w:tcBorders>
+            <w:shd w:fill="F5F5F5" w:val="clear"/>
+          </w:tcPr>
+          <w:p>
+            <w:pPr>
+              <w:pStyle w:val="Normal"/>
+              <w:rPr/>
+            </w:pPr>
+            <w:r>
+              <w:rPr>
+                <w:rFonts w:eastAsia="Courier New" w:cs="Courier New" w:ascii="Courier New" w:hAnsi="Courier New"/>
+                <w:color w:val="1F1F1F"/>
+                <w:sz w:val="20"/>
+                <w:szCs w:val="20"/>
+              </w:rPr>
+              <w:t>#</w:t>
+            </w:r>
+          </w:p>
+        </w:tc>
+        <w:tc>
+          <w:tcPr>
+            <w:tcW w:w="2600" w:type="dxa"/>
+            <w:tcBorders>
+              <w:top w:val="single" w:sz="2" w:space="0" w:color="CCCCCC"/>
+              <w:start w:val="single" w:sz="2" w:space="0" w:color="CCCCCC"/>
+              <w:bottom w:val="single" w:sz="2" w:space="0" w:color="CCCCCC"/>
+              <w:end w:val="single" w:sz="2" w:space="0" w:color="CCCCCC"/>
+            </w:tcBorders>
+            <w:shd w:fill="FFFFFF" w:val="clear"/>
+          </w:tcPr>
+          <w:p>
+            <w:pPr>
+              <w:pStyle w:val="Normal"/>
+              <w:rPr/>
+            </w:pPr>
+            <w:r>
+              <w:rPr>
+                <w:rFonts w:eastAsia="Arial" w:cs="Arial"/>
+                <w:color w:val="404040"/>
+                <w:sz w:val="20"/>
+                <w:szCs w:val="20"/>
+              </w:rPr>
+              <w:t>Hexadecimal</w:t>
+            </w:r>
+          </w:p>
+        </w:tc>
+        <w:tc>
+          <w:tcPr>
+            <w:tcW w:w="5360" w:type="dxa"/>
+            <w:tcBorders>
+              <w:top w:val="single" w:sz="2" w:space="0" w:color="CCCCCC"/>
+              <w:start w:val="single" w:sz="2" w:space="0" w:color="CCCCCC"/>
+              <w:bottom w:val="single" w:sz="2" w:space="0" w:color="CCCCCC"/>
+              <w:end w:val="single" w:sz="2" w:space="0" w:color="CCCCCC"/>
+            </w:tcBorders>
+            <w:shd w:fill="FFFFFF" w:val="clear"/>
+          </w:tcPr>
+          <w:p>
+            <w:pPr>
+              <w:pStyle w:val="Normal"/>
+              <w:rPr/>
+            </w:pPr>
+            <w:r>
+              <w:rPr>
+                <w:rFonts w:eastAsia="Courier New" w:cs="Courier New" w:ascii="Courier New" w:hAnsi="Courier New"/>
+                <w:color w:val="1F1F1F"/>
+                <w:sz w:val="20"/>
+                <w:szCs w:val="20"/>
+              </w:rPr>
+              <w:t xml:space="preserve">#FF   #1A2B   A = #8000</w:t>
+            </w:r>
+          </w:p>
+        </w:tc>
+      </w:tr>
+      <w:tr>
+        <w:trPr/>
+        <w:tc>
+          <w:tcPr>
+            <w:tcW w:w="1400" w:type="dxa"/>
+            <w:tcBorders>
+              <w:top w:val="single" w:sz="2" w:space="0" w:color="CCCCCC"/>
+              <w:start w:val="single" w:sz="2" w:space="0" w:color="CCCCCC"/>
+              <w:bottom w:val="single" w:sz="2" w:space="0" w:color="CCCCCC"/>
+              <w:end w:val="single" w:sz="2" w:space="0" w:color="CCCCCC"/>
+            </w:tcBorders>
+            <w:shd w:fill="F5F5F5" w:val="clear"/>
+          </w:tcPr>
+          <w:p>
+            <w:pPr>
+              <w:pStyle w:val="Normal"/>
+              <w:rPr/>
+            </w:pPr>
+            <w:r>
+              <w:rPr>
+                <w:rFonts w:eastAsia="Courier New" w:cs="Courier New" w:ascii="Courier New" w:hAnsi="Courier New"/>
+                <w:color w:val="1F1F1F"/>
+                <w:sz w:val="20"/>
+                <w:szCs w:val="20"/>
+              </w:rPr>
+              <w:t>@</w:t>
+            </w:r>
+          </w:p>
+        </w:tc>
+        <w:tc>
+          <w:tcPr>
+            <w:tcW w:w="2600" w:type="dxa"/>
+            <w:tcBorders>
+              <w:top w:val="single" w:sz="2" w:space="0" w:color="CCCCCC"/>
+              <w:start w:val="single" w:sz="2" w:space="0" w:color="CCCCCC"/>
+              <w:bottom w:val="single" w:sz="2" w:space="0" w:color="CCCCCC"/>
+              <w:end w:val="single" w:sz="2" w:space="0" w:color="CCCCCC"/>
+            </w:tcBorders>
+            <w:shd w:fill="FFFFFF" w:val="clear"/>
+          </w:tcPr>
+          <w:p>
+            <w:pPr>
+              <w:pStyle w:val="Normal"/>
+              <w:rPr/>
+            </w:pPr>
+            <w:r>
+              <w:rPr>
+                <w:rFonts w:eastAsia="Arial" w:cs="Arial"/>
+                <w:color w:val="404040"/>
+                <w:sz w:val="20"/>
+                <w:szCs w:val="20"/>
+              </w:rPr>
+              <w:t>Unsigned decimal</w:t>
+            </w:r>
+          </w:p>
+        </w:tc>
+        <w:tc>
+          <w:tcPr>
+            <w:tcW w:w="5360" w:type="dxa"/>
+            <w:tcBorders>
+              <w:top w:val="single" w:sz="2" w:space="0" w:color="CCCCCC"/>
+              <w:start w:val="single" w:sz="2" w:space="0" w:color="CCCCCC"/>
+              <w:bottom w:val="single" w:sz="2" w:space="0" w:color="CCCCCC"/>
+              <w:end w:val="single" w:sz="2" w:space="0" w:color="CCCCCC"/>
+            </w:tcBorders>
+            <w:shd w:fill="FFFFFF" w:val="clear"/>
+          </w:tcPr>
+          <w:p>
+            <w:pPr>
+              <w:pStyle w:val="Normal"/>
+              <w:rPr/>
+            </w:pPr>
+            <w:r>
+              <w:rPr>
+                <w:rFonts w:eastAsia="Courier New" w:cs="Courier New" w:ascii="Courier New" w:hAnsi="Courier New"/>
+                <w:color w:val="1F1F1F"/>
+                <w:sz w:val="20"/>
+                <w:szCs w:val="20"/>
+              </w:rPr>
+              <w:t xml:space="preserve">@65535   @32768   P = @65535</w:t>
+            </w:r>
+          </w:p>
+        </w:tc>
+      </w:tr>
+    </w:tbl>
+    <w:p>
+      <w:pPr>
+        <w:pStyle w:val="Normal"/>
+        <w:spacing w:before="60" w:after="60"/>
+        <w:rPr/>
+      </w:pPr>
+      <w:r>
+        <w:rPr>
+          <w:rFonts w:eastAsia="Arial" w:cs="Arial"/>
+          <w:sz w:val="22"/>
+          <w:szCs w:val="22"/>
+          <w:color w:val="1F1F1F"/>
+        </w:rPr>
+        <w:t xml:space="preserve">Prefixed literals are valid anywhere a numeric value is expected: assignment, arithmetic expressions, PRINT, IF conditions, and function arguments. There is no binary prefix; use hexadecimal for bit patterns (e.g. #0F instead of %00001111).</w:t>
+      </w:r>
+    </w:p>
+    <w:p>
+      <w:pPr>
+        <w:pStyle w:val="Normal"/>
+        <w:spacing w:before="80" w:after="80"/>
+        <w:rPr/>
+      </w:pPr>
+      <w:r>
+        <w:rPr/>
+      </w:r>
+    </w:p>
+    <w:p>
+      <w:pPr>
+        <w:pStyle w:val="Heading2"/>
+        <w:spacing w:before="280" w:after="80"/>
+        <w:rPr/>
+      </w:pPr>
+      <w:r>
+        <w:rPr>
+          <w:rFonts w:eastAsia="Arial" w:cs="Arial" w:ascii="Arial" w:hAnsi="Arial"/>
+          <w:b/>
+          <w:bCs/>
+          <w:color w:val="2E75B6"/>
+          <w:sz w:val="26"/>
+          <w:szCs w:val="26"/>
+        </w:rPr>
+        <w:t>4.3 Operator Precedence</w:t>
       </w:r>
     </w:p>
     <w:p>
@@ -3053,7 +3392,7 @@
           <w:sz w:val="26"/>
           <w:szCs w:val="26"/>
         </w:rPr>
-        <w:t>4.3 String Expressions</w:t>
+        <w:t>4.4 String Expressions</w:t>
       </w:r>
     </w:p>
     <w:p>
@@ -3130,7 +3469,7 @@
           <w:sz w:val="26"/>
           <w:szCs w:val="26"/>
         </w:rPr>
-        <w:t>4.4 Numeric Functions</w:t>
+        <w:t>4.5 Numeric Functions</w:t>
       </w:r>
     </w:p>
     <w:tbl>
@@ -3581,7 +3920,7 @@
           <w:sz w:val="26"/>
           <w:szCs w:val="26"/>
         </w:rPr>
-        <w:t>4.5 String Functions</w:t>
+        <w:t>4.6 String Functions</w:t>
       </w:r>
     </w:p>
     <w:tbl>
@@ -3778,6 +4117,120 @@
           </w:p>
         </w:tc>
       </w:tr>
+      <w:tr>
+        <w:trPr/>
+        <w:tc>
+          <w:tcPr>
+            <w:tcW w:w="2799" w:type="dxa"/>
+            <w:tcBorders>
+              <w:top w:val="single" w:sz="2" w:space="0" w:color="CCCCCC"/>
+              <w:start w:val="single" w:sz="2" w:space="0" w:color="CCCCCC"/>
+              <w:bottom w:val="single" w:sz="2" w:space="0" w:color="CCCCCC"/>
+              <w:end w:val="single" w:sz="2" w:space="0" w:color="CCCCCC"/>
+            </w:tcBorders>
+            <w:shd w:fill="F5F5F5" w:val="clear"/>
+          </w:tcPr>
+          <w:p>
+            <w:pPr>
+              <w:pStyle w:val="Normal"/>
+              <w:rPr/>
+            </w:pPr>
+            <w:r>
+              <w:rPr>
+                <w:rFonts w:eastAsia="Courier New" w:cs="Courier New" w:ascii="Courier New" w:hAnsi="Courier New"/>
+                <w:color w:val="1F1F1F"/>
+                <w:sz w:val="20"/>
+                <w:szCs w:val="20"/>
+              </w:rPr>
+              <w:t>HEX$(n)</w:t>
+            </w:r>
+          </w:p>
+        </w:tc>
+        <w:tc>
+          <w:tcPr>
+            <w:tcW w:w="6560" w:type="dxa"/>
+            <w:tcBorders>
+              <w:top w:val="single" w:sz="2" w:space="0" w:color="CCCCCC"/>
+              <w:start w:val="single" w:sz="2" w:space="0" w:color="CCCCCC"/>
+              <w:bottom w:val="single" w:sz="2" w:space="0" w:color="CCCCCC"/>
+              <w:end w:val="single" w:sz="2" w:space="0" w:color="CCCCCC"/>
+            </w:tcBorders>
+            <w:shd w:fill="FFFFFF" w:val="clear"/>
+          </w:tcPr>
+          <w:p>
+            <w:pPr>
+              <w:pStyle w:val="Normal"/>
+              <w:rPr/>
+            </w:pPr>
+            <w:r>
+              <w:rPr>
+                <w:rFonts w:eastAsia="Arial" w:cs="Arial"/>
+                <w:color w:val="404040"/>
+                <w:sz w:val="20"/>
+                <w:szCs w:val="20"/>
+              </w:rPr>
+              <w:t xml:space="preserve">Convert number n to uppercase hexadecimal string (e.g. FF, 1A2B). Treats n as unsigned 16-bit.</w:t>
+            </w:r>
+          </w:p>
+        </w:tc>
+      </w:tr>
+      <w:tr>
+        <w:trPr/>
+        <w:tc>
+          <w:tcPr>
+            <w:tcW w:w="2799" w:type="dxa"/>
+            <w:tcBorders>
+              <w:top w:val="single" w:sz="2" w:space="0" w:color="CCCCCC"/>
+              <w:start w:val="single" w:sz="2" w:space="0" w:color="CCCCCC"/>
+              <w:bottom w:val="single" w:sz="2" w:space="0" w:color="CCCCCC"/>
+              <w:end w:val="single" w:sz="2" w:space="0" w:color="CCCCCC"/>
+            </w:tcBorders>
+            <w:shd w:fill="F5F5F5" w:val="clear"/>
+          </w:tcPr>
+          <w:p>
+            <w:pPr>
+              <w:pStyle w:val="Normal"/>
+              <w:rPr/>
+            </w:pPr>
+            <w:r>
+              <w:rPr>
+                <w:rFonts w:eastAsia="Courier New" w:cs="Courier New" w:ascii="Courier New" w:hAnsi="Courier New"/>
+                <w:color w:val="1F1F1F"/>
+                <w:sz w:val="20"/>
+                <w:szCs w:val="20"/>
+              </w:rPr>
+              <w:t>UNS$(n)</w:t>
+            </w:r>
+          </w:p>
+        </w:tc>
+        <w:tc>
+          <w:tcPr>
+            <w:tcW w:w="6560" w:type="dxa"/>
+            <w:tcBorders>
+              <w:top w:val="single" w:sz="2" w:space="0" w:color="CCCCCC"/>
+              <w:start w:val="single" w:sz="2" w:space="0" w:color="CCCCCC"/>
+              <w:bottom w:val="single" w:sz="2" w:space="0" w:color="CCCCCC"/>
+              <w:end w:val="single" w:sz="2" w:space="0" w:color="CCCCCC"/>
+            </w:tcBorders>
+            <w:shd w:fill="FFFFFF" w:val="clear"/>
+          </w:tcPr>
+          <w:p>
+            <w:pPr>
+              <w:pStyle w:val="Normal"/>
+              <w:rPr/>
+            </w:pPr>
+            <w:r>
+              <w:rPr>
+                <w:rFonts w:eastAsia="Arial" w:cs="Arial"/>
+                <w:color w:val="404040"/>
+                <w:sz w:val="20"/>
+                <w:szCs w:val="20"/>
+              </w:rPr>
+              <w:t xml:space="preserve">Convert number n to unsigned decimal string (e.g. 65535). Treats n as unsigned 16-bit.</w:t>
+            </w:r>
+          </w:p>
+        </w:tc>
+      </w:tr>
     </w:tbl>
     <w:p>
       <w:pPr>
@@ -4444,16 +4897,7 @@
           <w:sz w:val="20"/>
           <w:szCs w:val="20"/>
         </w:rPr>
-        <w:t xml:space="preserve">  </w:t>
-      </w:r>
-      <w:r>
-        <w:rPr>
-          <w:rFonts w:eastAsia="Courier New" w:cs="Courier New" w:ascii="Courier New" w:hAnsi="Courier New"/>
-          <w:color w:val="1F1F1F"/>
-          <w:sz w:val="20"/>
-          <w:szCs w:val="20"/>
-        </w:rPr>
-        <w:t>PRINT I</w:t>
+        <w:t xml:space="preserve">  PRINT I</w:t>
       </w:r>
     </w:p>
     <w:p>

</xml_diff>

<commit_message>
added bitwise shifts << >> to basic
</commit_message>
<xml_diff>
--- a/documets/MICRO-BASIC-Manual.docx
+++ b/documets/MICRO-BASIC-Manual.docx
@@ -2116,6 +2116,120 @@
                 <w:szCs w:val="20"/>
               </w:rPr>
               <w:t>Bitwise XOR</w:t>
+            </w:r>
+          </w:p>
+        </w:tc>
+      </w:tr>
+      <w:tr>
+        <w:trPr/>
+        <w:tc>
+          <w:tcPr>
+            <w:tcW w:w="2000" w:type="dxa"/>
+            <w:tcBorders>
+              <w:top w:val="single" w:sz="2" w:space="0" w:color="CCCCCC"/>
+              <w:start w:val="single" w:sz="2" w:space="0" w:color="CCCCCC"/>
+              <w:bottom w:val="single" w:sz="2" w:space="0" w:color="CCCCCC"/>
+              <w:end w:val="single" w:sz="2" w:space="0" w:color="CCCCCC"/>
+            </w:tcBorders>
+            <w:shd w:fill="F5F5F5" w:val="clear"/>
+          </w:tcPr>
+          <w:p>
+            <w:pPr>
+              <w:pStyle w:val="Normal"/>
+              <w:rPr/>
+            </w:pPr>
+            <w:r>
+              <w:rPr>
+                <w:rFonts w:eastAsia="Courier New" w:cs="Courier New" w:ascii="Courier New" w:hAnsi="Courier New"/>
+                <w:color w:val="1F1F1F"/>
+                <w:sz w:val="20"/>
+                <w:szCs w:val="20"/>
+              </w:rPr>
+              <w:t>&lt;&lt;</w:t>
+            </w:r>
+          </w:p>
+        </w:tc>
+        <w:tc>
+          <w:tcPr>
+            <w:tcW w:w="7359" w:type="dxa"/>
+            <w:tcBorders>
+              <w:top w:val="single" w:sz="2" w:space="0" w:color="CCCCCC"/>
+              <w:start w:val="single" w:sz="2" w:space="0" w:color="CCCCCC"/>
+              <w:bottom w:val="single" w:sz="2" w:space="0" w:color="CCCCCC"/>
+              <w:end w:val="single" w:sz="2" w:space="0" w:color="CCCCCC"/>
+            </w:tcBorders>
+            <w:shd w:fill="FFFFFF" w:val="clear"/>
+          </w:tcPr>
+          <w:p>
+            <w:pPr>
+              <w:pStyle w:val="Normal"/>
+              <w:rPr/>
+            </w:pPr>
+            <w:r>
+              <w:rPr>
+                <w:rFonts w:eastAsia="Arial" w:cs="Arial"/>
+                <w:color w:val="404040"/>
+                <w:sz w:val="20"/>
+                <w:szCs w:val="20"/>
+              </w:rPr>
+              <w:t>Logical left shift (unsigned). e.g. 1 &lt;&lt; 4 = 16</w:t>
+            </w:r>
+          </w:p>
+        </w:tc>
+      </w:tr>
+      <w:tr>
+        <w:trPr/>
+        <w:tc>
+          <w:tcPr>
+            <w:tcW w:w="2000" w:type="dxa"/>
+            <w:tcBorders>
+              <w:top w:val="single" w:sz="2" w:space="0" w:color="CCCCCC"/>
+              <w:start w:val="single" w:sz="2" w:space="0" w:color="CCCCCC"/>
+              <w:bottom w:val="single" w:sz="2" w:space="0" w:color="CCCCCC"/>
+              <w:end w:val="single" w:sz="2" w:space="0" w:color="CCCCCC"/>
+            </w:tcBorders>
+            <w:shd w:fill="F5F5F5" w:val="clear"/>
+          </w:tcPr>
+          <w:p>
+            <w:pPr>
+              <w:pStyle w:val="Normal"/>
+              <w:rPr/>
+            </w:pPr>
+            <w:r>
+              <w:rPr>
+                <w:rFonts w:eastAsia="Courier New" w:cs="Courier New" w:ascii="Courier New" w:hAnsi="Courier New"/>
+                <w:color w:val="1F1F1F"/>
+                <w:sz w:val="20"/>
+                <w:szCs w:val="20"/>
+              </w:rPr>
+              <w:t>&gt;&gt;</w:t>
+            </w:r>
+          </w:p>
+        </w:tc>
+        <w:tc>
+          <w:tcPr>
+            <w:tcW w:w="7359" w:type="dxa"/>
+            <w:tcBorders>
+              <w:top w:val="single" w:sz="2" w:space="0" w:color="CCCCCC"/>
+              <w:start w:val="single" w:sz="2" w:space="0" w:color="CCCCCC"/>
+              <w:bottom w:val="single" w:sz="2" w:space="0" w:color="CCCCCC"/>
+              <w:end w:val="single" w:sz="2" w:space="0" w:color="CCCCCC"/>
+            </w:tcBorders>
+            <w:shd w:fill="FFFFFF" w:val="clear"/>
+          </w:tcPr>
+          <w:p>
+            <w:pPr>
+              <w:pStyle w:val="Normal"/>
+              <w:rPr/>
+            </w:pPr>
+            <w:r>
+              <w:rPr>
+                <w:rFonts w:eastAsia="Arial" w:cs="Arial"/>
+                <w:color w:val="404040"/>
+                <w:sz w:val="20"/>
+                <w:szCs w:val="20"/>
+              </w:rPr>
+              <w:t>Logical right shift (unsigned). e.g. #FF &gt;&gt; 4 = 15</w:t>
             </w:r>
           </w:p>
         </w:tc>
@@ -2979,7 +3093,7 @@
           <w:sz w:val="22"/>
           <w:szCs w:val="22"/>
         </w:rPr>
-        <w:t>&amp;, |, ^  (bitwise)</w:t>
+        <w:t>&amp;, |, ^, &lt;&lt;, &gt;&gt;  (bitwise and bit shift)</w:t>
       </w:r>
     </w:p>
     <w:p>

</xml_diff>